<commit_message>
V14: Engraved 145-159, 177-79, 191-End. Created v3 Errata List
</commit_message>
<xml_diff>
--- a/Manuscript and House Style/Bonecas Russas_Text_Translation.docx
+++ b/Manuscript and House Style/Bonecas Russas_Text_Translation.docx
@@ -383,7 +383,25 @@
           <w:iCs/>
           <w:color w:val="000000" w:themeColor="text1"/>
         </w:rPr>
-        <w:t xml:space="preserve">, like collectors, hide dolls that are just like ourselves, one inside the other. But it's not just us, as nature is also </w:t>
+        <w:t xml:space="preserve">, like collectors, hide dolls that are just like </w:t>
+      </w:r>
+      <w:proofErr w:type="gramStart"/>
+      <w:r>
+        <w:rPr>
+          <w:i/>
+          <w:iCs/>
+          <w:color w:val="000000" w:themeColor="text1"/>
+        </w:rPr>
+        <w:t>ourselves</w:t>
+      </w:r>
+      <w:proofErr w:type="gramEnd"/>
+      <w:r>
+        <w:rPr>
+          <w:i/>
+          <w:iCs/>
+          <w:color w:val="000000" w:themeColor="text1"/>
+        </w:rPr>
+        <w:t xml:space="preserve">, one inside the other. But it's not just us, as nature is also </w:t>
       </w:r>
       <w:r>
         <w:rPr>
@@ -1088,6 +1106,7 @@
     </w:p>
     <w:p>
       <w:pPr>
+        <w:jc w:val="center"/>
         <w:rPr>
           <w:color w:val="000000" w:themeColor="text1"/>
           <w:lang w:val="pt-BR"/>

</xml_diff>